<commit_message>
Finalize submission render QA and chapter/output hardening
- Fix Chapter 2 duplicate Figure 2.2 caption and Chapter 3 heading parsing
- Harden Chapter 5 plain-text O1/O5 criteria wording and formalize Chapter 6 opening
- Add deterministic Harvard CSL wiring for final packaging
- Add Word COM UI render inspection workflow, task, and reports
- Regenerate merged draft and final DOCX outputs
- Sync governance logs and state/timeline checkpoints (C-647, D-335)
</commit_message>
<xml_diff>
--- a/08_writing/Project Cover Page.docx
+++ b/08_writing/Project Cover Page.docx
@@ -353,7 +353,15 @@
           <w:sz w:val="32"/>
           <w:lang w:eastAsia="en-US"/>
         </w:rPr>
-        <w:t xml:space="preserve"> alex</w:t>
+        <w:t xml:space="preserve"> </w:t>
+      </w:r>
+      <w:r>
+        <w:rPr>
+          <w:rFonts w:asciiTheme="minorHAnsi" w:hAnsiTheme="minorHAnsi"/>
+          <w:sz w:val="32"/>
+          <w:lang w:eastAsia="en-US"/>
+        </w:rPr>
+        <w:t>Thomas Xuereb</w:t>
       </w:r>
     </w:p>
     <w:p>
@@ -396,7 +404,23 @@
           <w:sz w:val="32"/>
           <w:lang w:eastAsia="en-US"/>
         </w:rPr>
-        <w:t xml:space="preserve"> 07/05/2026</w:t>
+        <w:t xml:space="preserve"> 0</w:t>
+      </w:r>
+      <w:r>
+        <w:rPr>
+          <w:rFonts w:asciiTheme="minorHAnsi" w:hAnsiTheme="minorHAnsi"/>
+          <w:sz w:val="32"/>
+          <w:lang w:eastAsia="en-US"/>
+        </w:rPr>
+        <w:t>8</w:t>
+      </w:r>
+      <w:r>
+        <w:rPr>
+          <w:rFonts w:asciiTheme="minorHAnsi" w:hAnsiTheme="minorHAnsi"/>
+          <w:sz w:val="32"/>
+          <w:lang w:eastAsia="en-US"/>
+        </w:rPr>
+        <w:t>/05/2026</w:t>
       </w:r>
     </w:p>
     <w:p>
@@ -678,41 +702,79 @@
         <w:rPr>
           <w:rFonts w:asciiTheme="minorHAnsi" w:hAnsiTheme="minorHAnsi"/>
         </w:rPr>
-        <w:t>It is acknowledged that the author of any project work shall own the copyright.However, by submitting such copyright work for assessment, the author grants to the University a perpetual royalty-free licence to do all or any of those things referred to in section 16(i) of the Copyright Designs and Patents Act 1988.(viz: to copy work; to issue copies to the public; to perform or show or play the work in public; to broadcast the work or to make an adaptation of the work).</w:t>
-      </w:r>
-    </w:p>
-    <w:p>
-      <w:pPr>
-        <w:rPr>
-          <w:rFonts w:asciiTheme="minorHAnsi" w:hAnsiTheme="minorHAnsi"/>
-        </w:rPr>
-      </w:pPr>
-    </w:p>
-    <w:p>
-      <w:pPr>
-        <w:rPr>
-          <w:rFonts w:asciiTheme="minorHAnsi" w:hAnsiTheme="minorHAnsi"/>
-        </w:rPr>
-      </w:pPr>
-    </w:p>
-    <w:p>
-      <w:pPr>
-        <w:rPr>
-          <w:rFonts w:asciiTheme="minorHAnsi" w:hAnsiTheme="minorHAnsi"/>
-        </w:rPr>
-      </w:pPr>
-    </w:p>
-    <w:p>
-      <w:pPr>
-        <w:rPr>
-          <w:rFonts w:asciiTheme="minorHAnsi" w:hAnsiTheme="minorHAnsi"/>
-        </w:rPr>
-      </w:pPr>
-      <w:r>
-        <w:rPr>
-          <w:rFonts w:asciiTheme="minorHAnsi" w:hAnsiTheme="minorHAnsi"/>
-        </w:rPr>
-        <w:t>Student Name :</w:t>
+        <w:t>It is acknowledged that the author of any project work shall own the copyright.</w:t>
+      </w:r>
+      <w:r>
+        <w:rPr>
+          <w:rFonts w:asciiTheme="minorHAnsi" w:hAnsiTheme="minorHAnsi"/>
+        </w:rPr>
+        <w:t xml:space="preserve"> </w:t>
+      </w:r>
+      <w:r>
+        <w:rPr>
+          <w:rFonts w:asciiTheme="minorHAnsi" w:hAnsiTheme="minorHAnsi"/>
+        </w:rPr>
+        <w:t>However, by submitting such copyright work for assessment, the author grants to the University a perpetual royalty-free licence to do all or any of those things referred to in section 16(</w:t>
+      </w:r>
+      <w:proofErr w:type="spellStart"/>
+      <w:r>
+        <w:rPr>
+          <w:rFonts w:asciiTheme="minorHAnsi" w:hAnsiTheme="minorHAnsi"/>
+        </w:rPr>
+        <w:t>i</w:t>
+      </w:r>
+      <w:proofErr w:type="spellEnd"/>
+      <w:r>
+        <w:rPr>
+          <w:rFonts w:asciiTheme="minorHAnsi" w:hAnsiTheme="minorHAnsi"/>
+        </w:rPr>
+        <w:t>) of the Copyright Designs and Patents Act 1988.</w:t>
+      </w:r>
+      <w:r>
+        <w:rPr>
+          <w:rFonts w:asciiTheme="minorHAnsi" w:hAnsiTheme="minorHAnsi"/>
+        </w:rPr>
+        <w:t xml:space="preserve"> </w:t>
+      </w:r>
+      <w:r>
+        <w:rPr>
+          <w:rFonts w:asciiTheme="minorHAnsi" w:hAnsiTheme="minorHAnsi"/>
+        </w:rPr>
+        <w:t>(viz: to copy work; to issue copies to the public; to perform or show or play the work in public; to broadcast the work or to make an adaptation of the work).</w:t>
+      </w:r>
+    </w:p>
+    <w:p>
+      <w:pPr>
+        <w:rPr>
+          <w:rFonts w:asciiTheme="minorHAnsi" w:hAnsiTheme="minorHAnsi"/>
+        </w:rPr>
+      </w:pPr>
+    </w:p>
+    <w:p>
+      <w:pPr>
+        <w:rPr>
+          <w:rFonts w:asciiTheme="minorHAnsi" w:hAnsiTheme="minorHAnsi"/>
+        </w:rPr>
+      </w:pPr>
+    </w:p>
+    <w:p>
+      <w:pPr>
+        <w:rPr>
+          <w:rFonts w:asciiTheme="minorHAnsi" w:hAnsiTheme="minorHAnsi"/>
+        </w:rPr>
+      </w:pPr>
+    </w:p>
+    <w:p>
+      <w:pPr>
+        <w:rPr>
+          <w:rFonts w:asciiTheme="minorHAnsi" w:hAnsiTheme="minorHAnsi"/>
+        </w:rPr>
+      </w:pPr>
+      <w:r>
+        <w:rPr>
+          <w:rFonts w:asciiTheme="minorHAnsi" w:hAnsiTheme="minorHAnsi"/>
+        </w:rPr>
+        <w:t>Student Name:</w:t>
       </w:r>
       <w:r>
         <w:rPr>
@@ -799,7 +861,7 @@
           <w:noProof/>
         </w:rPr>
         <w:drawing>
-          <wp:inline distT="0" distB="0" distL="0" distR="0" wp14:anchorId="43D5DF5B" wp14:editId="246D4CE0">
+          <wp:inline distT="0" distB="0" distL="0" distR="0" wp14:anchorId="2F7271D7" wp14:editId="74EC6253">
             <wp:extent cx="1570881" cy="425926"/>
             <wp:effectExtent l="0" t="0" r="0" b="0"/>
             <wp:docPr id="857271336" name="Picture 52"/>

</xml_diff>

<commit_message>
Update cover page metadata and regenerated report artifacts
</commit_message>
<xml_diff>
--- a/08_writing/Project Cover Page.docx
+++ b/08_writing/Project Cover Page.docx
@@ -361,7 +361,7 @@
           <w:sz w:val="32"/>
           <w:lang w:eastAsia="en-US"/>
         </w:rPr>
-        <w:t>Thomas Xuereb</w:t>
+        <w:t>Steven Xuereb</w:t>
       </w:r>
     </w:p>
     <w:p>
@@ -617,7 +617,6 @@
           <w:b/>
           <w:sz w:val="32"/>
         </w:rPr>
-        <w:lastRenderedPageBreak/>
         <w:t>Declaration Sheet</w:t>
       </w:r>
     </w:p>
@@ -714,21 +713,7 @@
         <w:rPr>
           <w:rFonts w:asciiTheme="minorHAnsi" w:hAnsiTheme="minorHAnsi"/>
         </w:rPr>
-        <w:t>However, by submitting such copyright work for assessment, the author grants to the University a perpetual royalty-free licence to do all or any of those things referred to in section 16(</w:t>
-      </w:r>
-      <w:proofErr w:type="spellStart"/>
-      <w:r>
-        <w:rPr>
-          <w:rFonts w:asciiTheme="minorHAnsi" w:hAnsiTheme="minorHAnsi"/>
-        </w:rPr>
-        <w:t>i</w:t>
-      </w:r>
-      <w:proofErr w:type="spellEnd"/>
-      <w:r>
-        <w:rPr>
-          <w:rFonts w:asciiTheme="minorHAnsi" w:hAnsiTheme="minorHAnsi"/>
-        </w:rPr>
-        <w:t>) of the Copyright Designs and Patents Act 1988.</w:t>
+        <w:t>However, by submitting such copyright work for assessment, the author grants to the University a perpetual royalty-free licence to do all or any of those things referred to in section 16(i) of the Copyright Designs and Patents Act 1988.</w:t>
       </w:r>
       <w:r>
         <w:rPr>
@@ -861,7 +846,7 @@
           <w:noProof/>
         </w:rPr>
         <w:drawing>
-          <wp:inline distT="0" distB="0" distL="0" distR="0" wp14:anchorId="2F7271D7" wp14:editId="74EC6253">
+          <wp:inline distT="0" distB="0" distL="0" distR="0" wp14:anchorId="2F7271D7" wp14:editId="3935A180">
             <wp:extent cx="1570881" cy="425926"/>
             <wp:effectExtent l="0" t="0" r="0" b="0"/>
             <wp:docPr id="857271336" name="Picture 52"/>

</xml_diff>